<commit_message>
Runbook: cloud-only access, add App URL; remove local run instructions
Made-with: Cursor
</commit_message>
<xml_diff>
--- a/RUNBOOK.docx
+++ b/RUNBOOK.docx
@@ -68,41 +68,31 @@
     </w:p>
     <w:p>
       <w:r>
-        <w:t>• Streamlit Cloud (recommended): Use the shared app URL (e.g. from your team or deployment).</w:t>
+        <w:t>The tool runs on Streamlit Cloud. No local installation required.</w:t>
+      </w:r>
+    </w:p>
+    <w:p/>
+    <w:p>
+      <w:r>
+        <w:rPr>
+          <w:b/>
+        </w:rPr>
+        <w:t>App URL:</w:t>
       </w:r>
     </w:p>
     <w:p>
       <w:r>
-        <w:t>• Local run:</w:t>
-      </w:r>
-    </w:p>
-    <w:p>
-      <w:pPr>
-        <w:pStyle w:val="ListBullet"/>
-      </w:pPr>
-      <w:r>
-        <w:t xml:space="preserve">  cd TDR-mapping</w:t>
-      </w:r>
-    </w:p>
-    <w:p>
-      <w:pPr>
-        <w:pStyle w:val="ListBullet"/>
-      </w:pPr>
-      <w:r>
-        <w:t xml:space="preserve">  pip install -r requirements.txt</w:t>
-      </w:r>
-    </w:p>
-    <w:p>
-      <w:pPr>
-        <w:pStyle w:val="ListBullet"/>
-      </w:pPr>
-      <w:r>
-        <w:t xml:space="preserve">  streamlit run app.py</w:t>
+        <w:t>https://tdr-streamlit-sharepoint.streamlit.app</w:t>
       </w:r>
     </w:p>
     <w:p>
       <w:r>
-        <w:t xml:space="preserve">  Then open the URL shown in the terminal (e.g. http://localhost:8501).</w:t>
+        <w:t>(Use the URL above, or the URL shared by your team if different.)</w:t>
+      </w:r>
+    </w:p>
+    <w:p>
+      <w:r>
+        <w:t>• Open the URL in a browser to use the app.</w:t>
       </w:r>
     </w:p>
     <w:p/>

</xml_diff>